<commit_message>
State the side-constraint exception, per-subject consistency and the post hoc status of alpha = 1
Two of 742 outputs (ITL of S01 L5 and S02 L4) keep their GCZ position under the side constraint;
the text and README now say so instead of claiming that every output lies in the projection
region. Significance statements refer to paired comparisons within the evaluated set and are
reported with the per-subject consistency, which revision_analyses.py now records. The alpha = 1
row of the ablation is marked as a post-evaluation comparison. Submission files: current title in
the cover letter and Statement of Significance, regenerated Word versions, updated README.
</commit_message>
<xml_diff>
--- a/manuscript/submission/Statement_of_Significance.docx
+++ b/manuscript/submission/Statement_of_Significance.docx
@@ -158,7 +158,7 @@
         <w:pStyle w:val="FirstParagraph"/>
       </w:pPr>
       <w:r>
-        <w:t xml:space="preserve">GCZ-RL localizes sparse spinal ligament attachment landmarks on vertebral surface meshes by learning annotation-calibrated admissible regions and a bounded residual correction of rigid atlas transfer. Every output is projected onto the admissible region of its class, so the learned component refines a geometrically valid estimate and cannot move a landmark outside that region (Introduction, contributions 1 and 2; Sections 3.4–3.7).</w:t>
+        <w:t xml:space="preserve">GCZ-RL localizes sparse spinal ligament attachment landmarks on vertebral surface meshes by learning annotation-calibrated admissible regions and a bounded residual correction of rigid atlas transfer. Every corrected output is projected onto the admissible region of its class, so the learned component refines a geometrically valid estimate and cannot move a landmark outside that region; a bilateral point whose region has no vertex on its side keeps its GCZ position (Introduction, contributions 1 and 2; Sections 3.4–3.10).</w:t>
       </w:r>
     </w:p>
     <w:bookmarkEnd w:id="12"/>
@@ -280,7 +280,7 @@
         <w:pStyle w:val="FirstParagraph"/>
       </w:pPr>
       <w:r>
-        <w:t xml:space="preserve">GCZ-RL is significantly better than the geometry-only GCZ baseline. It is not significantly different from SLD, the dedicated state-of-the-art detector.</w:t>
+        <w:t xml:space="preserve">GCZ-RL is better than the geometry-only GCZ baseline for each of the three held-out subjects, with paired tests over the evaluated vertebra–class cases supporting the difference within this cohort. It is not significantly different from SLD, the dedicated state-of-the-art detector.</w:t>
       </w:r>
     </w:p>
     <w:p>
@@ -1066,7 +1066,66 @@
           <w:b/>
           <w:bCs/>
         </w:rPr>
-        <w:t xml:space="preserve">[AUTHORS: answer this question accurately before submission.]</w:t>
+        <w:t xml:space="preserve">[AUTHORS: confirm and edit]</w:t>
+      </w:r>
+      <w:r>
+        <w:t xml:space="preserve"> </w:t>
+      </w:r>
+      <w:r>
+        <w:t xml:space="preserve">Yes. Claude (Anthropic) was used to:</w:t>
+      </w:r>
+    </w:p>
+    <w:p>
+      <w:pPr>
+        <w:pStyle w:val="Compact"/>
+        <w:numPr>
+          <w:ilvl w:val="0"/>
+          <w:numId w:val="1015"/>
+        </w:numPr>
+      </w:pPr>
+      <w:r>
+        <w:t xml:space="preserve">reformat the manuscript to the journal template;</w:t>
+      </w:r>
+    </w:p>
+    <w:p>
+      <w:pPr>
+        <w:pStyle w:val="Compact"/>
+        <w:numPr>
+          <w:ilvl w:val="0"/>
+          <w:numId w:val="1015"/>
+        </w:numPr>
+      </w:pPr>
+      <w:r>
+        <w:t xml:space="preserve">check that reported numbers agree with the released code and saved outputs;</w:t>
+      </w:r>
+    </w:p>
+    <w:p>
+      <w:pPr>
+        <w:pStyle w:val="Compact"/>
+        <w:numPr>
+          <w:ilvl w:val="0"/>
+          <w:numId w:val="1015"/>
+        </w:numPr>
+      </w:pPr>
+      <w:r>
+        <w:t xml:space="preserve">improve language.</w:t>
+      </w:r>
+    </w:p>
+    <w:p>
+      <w:pPr>
+        <w:pStyle w:val="FirstParagraph"/>
+      </w:pPr>
+      <w:r>
+        <w:t xml:space="preserve">Every number in the manuscript was regenerated from the released code. Every reference was checked against its DOI record (Crossref). The authors reviewed all text. The statement appears in the section</w:t>
+      </w:r>
+      <w:r>
+        <w:t xml:space="preserve"> </w:t>
+      </w:r>
+      <w:r>
+        <w:t xml:space="preserve">“Declaration of generative AI and AI-assisted technologies in the manuscript preparation process”</w:t>
+      </w:r>
+      <w:r>
+        <w:t xml:space="preserve">.</w:t>
       </w:r>
     </w:p>
     <w:bookmarkEnd w:id="24"/>
@@ -1484,6 +1543,9 @@
     <w:abstractNumId w:val="991"/>
   </w:num>
   <w:num w:numId="1014">
+    <w:abstractNumId w:val="991"/>
+  </w:num>
+  <w:num w:numId="1015">
     <w:abstractNumId w:val="991"/>
   </w:num>
 </w:numbering>

</xml_diff>